<commit_message>
Descripción de los cambios realizados
</commit_message>
<xml_diff>
--- a/Gnombres_Dat252.docx
+++ b/Gnombres_Dat252.docx
@@ -1,6 +1,6 @@
 
 <file path=word/document.xml><?xml version="1.0" encoding="utf-8"?>
-<w:document xmlns:wpc="http://schemas.microsoft.com/office/word/2010/wordprocessingCanvas" xmlns:cx="http://schemas.microsoft.com/office/drawing/2014/chartex" xmlns:cx1="http://schemas.microsoft.com/office/drawing/2015/9/8/chartex" xmlns:mc="http://schemas.openxmlformats.org/markup-compatibility/2006" xmlns:o="urn:schemas-microsoft-com:office:office" xmlns:r="http://schemas.openxmlformats.org/officeDocument/2006/relationships" xmlns:m="http://schemas.openxmlformats.org/officeDocument/2006/math" xmlns:v="urn:schemas-microsoft-com:vml" xmlns:wp14="http://schemas.microsoft.com/office/word/2010/wordprocessingDrawing" xmlns:wp="http://schemas.openxmlformats.org/drawingml/2006/wordprocessingDrawing" xmlns:w10="urn:schemas-microsoft-com:office:word" xmlns:w="http://schemas.openxmlformats.org/wordprocessingml/2006/main" xmlns:w14="http://schemas.microsoft.com/office/word/2010/wordml" xmlns:w15="http://schemas.microsoft.com/office/word/2012/wordml" xmlns:w16se="http://schemas.microsoft.com/office/word/2015/wordml/symex" xmlns:wpg="http://schemas.microsoft.com/office/word/2010/wordprocessingGroup" xmlns:wpi="http://schemas.microsoft.com/office/word/2010/wordprocessingInk" xmlns:wne="http://schemas.microsoft.com/office/word/2006/wordml" xmlns:wps="http://schemas.microsoft.com/office/word/2010/wordprocessingShape" mc:Ignorable="w14 w15 w16se wp14">
+<w:document xmlns:wpc="http://schemas.microsoft.com/office/word/2010/wordprocessingCanvas" xmlns:mc="http://schemas.openxmlformats.org/markup-compatibility/2006" xmlns:o="urn:schemas-microsoft-com:office:office" xmlns:r="http://schemas.openxmlformats.org/officeDocument/2006/relationships" xmlns:m="http://schemas.openxmlformats.org/officeDocument/2006/math" xmlns:v="urn:schemas-microsoft-com:vml" xmlns:wp14="http://schemas.microsoft.com/office/word/2010/wordprocessingDrawing" xmlns:wp="http://schemas.openxmlformats.org/drawingml/2006/wordprocessingDrawing" xmlns:w10="urn:schemas-microsoft-com:office:word" xmlns:w="http://schemas.openxmlformats.org/wordprocessingml/2006/main" xmlns:w14="http://schemas.microsoft.com/office/word/2010/wordml" xmlns:w15="http://schemas.microsoft.com/office/word/2012/wordml" xmlns:w16se="http://schemas.microsoft.com/office/word/2015/wordml/symex" xmlns:w16cid="http://schemas.microsoft.com/office/word/2016/wordml/cid" xmlns:w16="http://schemas.microsoft.com/office/word/2018/wordml" xmlns:w16cex="http://schemas.microsoft.com/office/word/2018/wordml/cex" xmlns:w16sdtdh="http://schemas.microsoft.com/office/word/2020/wordml/sdtdatahash" xmlns:wne="http://schemas.microsoft.com/office/word/2006/wordml" xmlns:wpg="http://schemas.microsoft.com/office/word/2010/wordprocessingGroup" xmlns:wps="http://schemas.microsoft.com/office/word/2010/wordprocessingShape" mc:Ignorable="w14 w15 w16se w16cid w16 w16cex w16sdtdh wp14">
   <w:body>
     <w:p>
       <w:pPr>
@@ -8,15 +8,16 @@
         <w:jc w:val="center"/>
         <w:rPr>
           <w:color w:val="000000" w:themeColor="text1"/>
-          <w:lang w:val="es-BO"/>
         </w:rPr>
       </w:pPr>
       <w:r>
         <w:rPr>
+          <w:rFonts w:ascii="Arial" w:hAnsi="Arial" w:eastAsia="ＭＳ 明朝" w:cs="Arial" w:eastAsiaTheme="minorEastAsia" w:csTheme="minorBidi"/>
           <w:b/>
+          <w:bCs/>
           <w:color w:val="000000" w:themeColor="text1"/>
           <w:sz w:val="36"/>
-          <w:lang w:val="es-BO"/>
+          <w:szCs w:val="22"/>
         </w:rPr>
         <w:t>UNIVERSIDAD MAYOR DE SAN ANDRÉS</w:t>
       </w:r>
@@ -30,16 +31,16 @@
           <w:color w:val="000000" w:themeColor="text1"/>
           <w:sz w:val="28"/>
           <w:szCs w:val="28"/>
-          <w:lang w:val="es-BO"/>
         </w:rPr>
       </w:pPr>
       <w:r>
         <w:rPr>
+          <w:rFonts w:ascii="Arial" w:hAnsi="Arial" w:eastAsia="ＭＳ 明朝" w:cs="Arial" w:eastAsiaTheme="minorEastAsia" w:csTheme="minorBidi"/>
           <w:b/>
+          <w:bCs/>
           <w:color w:val="000000" w:themeColor="text1"/>
           <w:sz w:val="28"/>
           <w:szCs w:val="28"/>
-          <w:lang w:val="es-BO"/>
         </w:rPr>
         <w:t>FACULTAD DE CIENCIAS PURAS Y NATURALES</w:t>
       </w:r>
@@ -53,16 +54,16 @@
           <w:color w:val="000000" w:themeColor="text1"/>
           <w:sz w:val="28"/>
           <w:szCs w:val="28"/>
-          <w:lang w:val="es-BO"/>
         </w:rPr>
       </w:pPr>
       <w:r>
         <w:rPr>
+          <w:rFonts w:ascii="Arial" w:hAnsi="Arial" w:eastAsia="ＭＳ 明朝" w:cs="Arial" w:eastAsiaTheme="minorEastAsia" w:csTheme="minorBidi"/>
           <w:b/>
+          <w:bCs/>
           <w:color w:val="000000" w:themeColor="text1"/>
           <w:sz w:val="28"/>
           <w:szCs w:val="28"/>
-          <w:lang w:val="es-BO"/>
         </w:rPr>
         <w:t>CARRERA DE INFORMÁTICA</w:t>
       </w:r>
@@ -75,7 +76,6 @@
           <w:b/>
           <w:color w:val="000000" w:themeColor="text1"/>
           <w:sz w:val="24"/>
-          <w:lang w:val="es-BO"/>
         </w:rPr>
       </w:pPr>
     </w:p>
@@ -87,7 +87,6 @@
           <w:b/>
           <w:color w:val="000000" w:themeColor="text1"/>
           <w:sz w:val="24"/>
-          <w:lang w:val="es-BO"/>
         </w:rPr>
       </w:pPr>
     </w:p>
@@ -103,7 +102,13 @@
           <w:insideV w:val="single" w:sz="4" w:space="0" w:color="auto"/>
         </w:tblBorders>
         <w:tblLayout w:type="fixed"/>
-        <w:tblLook w:val="04A0" w:firstRow="1" w:lastRow="0" w:firstColumn="1" w:lastColumn="0" w:noHBand="0" w:noVBand="1"/>
+        <w:tblCellMar>
+          <w:top w:w="0" w:type="dxa"/>
+          <w:left w:w="108" w:type="dxa"/>
+          <w:bottom w:w="0" w:type="dxa"/>
+          <w:right w:w="108" w:type="dxa"/>
+        </w:tblCellMar>
+        <w:tblLook w:firstRow="1" w:firstColumn="1" w:noVBand="1"/>
       </w:tblPr>
       <w:tblGrid>
         <w:gridCol w:w="1963"/>
@@ -113,7 +118,13 @@
         <w:tc>
           <w:tcPr>
             <w:tcW w:w="1963" w:type="dxa"/>
-            <w:shd w:val="clear" w:color="auto" w:fill="F7FAFC"/>
+            <w:tcBorders>
+              <w:top w:val="single" w:sz="4" w:space="0" w:color="auto"/>
+              <w:left w:val="single" w:sz="4" w:space="0" w:color="auto"/>
+              <w:bottom w:val="single" w:sz="4" w:space="0" w:color="auto"/>
+              <w:right w:val="single" w:sz="4" w:space="0" w:color="auto"/>
+            </w:tcBorders>
+            <w:shd w:val="clear" w:fill="F7FAFC"/>
             <w:tcMar>
               <w:top w:w="80" w:type="dxa"/>
               <w:left w:w="120" w:type="dxa"/>
@@ -126,15 +137,16 @@
               <w:spacing w:before="80" w:after="80"/>
               <w:rPr>
                 <w:color w:val="000000" w:themeColor="text1"/>
-                <w:lang w:val="es-BO"/>
               </w:rPr>
             </w:pPr>
             <w:r>
               <w:rPr>
+                <w:rFonts w:ascii="Arial" w:hAnsi="Arial" w:eastAsia="ＭＳ 明朝" w:cs="Arial" w:eastAsiaTheme="minorEastAsia" w:csTheme="minorBidi"/>
                 <w:b/>
+                <w:bCs/>
                 <w:color w:val="000000" w:themeColor="text1"/>
                 <w:sz w:val="21"/>
-                <w:lang w:val="es-BO"/>
+                <w:szCs w:val="22"/>
               </w:rPr>
               <w:t>MATERIA:</w:t>
             </w:r>
@@ -143,7 +155,13 @@
         <w:tc>
           <w:tcPr>
             <w:tcW w:w="7397" w:type="dxa"/>
-            <w:shd w:val="clear" w:color="auto" w:fill="FFFFFF"/>
+            <w:tcBorders>
+              <w:top w:val="single" w:sz="4" w:space="0" w:color="auto"/>
+              <w:left w:val="single" w:sz="4" w:space="0" w:color="auto"/>
+              <w:bottom w:val="single" w:sz="4" w:space="0" w:color="auto"/>
+              <w:right w:val="single" w:sz="4" w:space="0" w:color="auto"/>
+            </w:tcBorders>
+            <w:shd w:val="clear" w:fill="FFFFFF"/>
             <w:tcMar>
               <w:top w:w="80" w:type="dxa"/>
               <w:left w:w="120" w:type="dxa"/>
@@ -156,24 +174,16 @@
               <w:spacing w:before="80" w:after="80"/>
               <w:rPr>
                 <w:color w:val="000000" w:themeColor="text1"/>
-                <w:lang w:val="es-BO"/>
               </w:rPr>
             </w:pPr>
             <w:r>
               <w:rPr>
+                <w:rFonts w:ascii="Arial" w:hAnsi="Arial" w:eastAsia="ＭＳ 明朝" w:cs="Arial" w:eastAsiaTheme="minorEastAsia" w:csTheme="minorBidi"/>
                 <w:color w:val="000000" w:themeColor="text1"/>
                 <w:sz w:val="21"/>
-                <w:lang w:val="es-BO"/>
+                <w:szCs w:val="22"/>
               </w:rPr>
-              <w:t>[ Nombre de la Materia</w:t>
-            </w:r>
-            <w:r>
-              <w:rPr>
-                <w:color w:val="000000" w:themeColor="text1"/>
-                <w:sz w:val="21"/>
-                <w:lang w:val="es-BO"/>
-              </w:rPr>
-              <w:t xml:space="preserve"> ]</w:t>
+              <w:t>Metodo de Broyden</w:t>
             </w:r>
           </w:p>
         </w:tc>
@@ -182,7 +192,13 @@
         <w:tc>
           <w:tcPr>
             <w:tcW w:w="1963" w:type="dxa"/>
-            <w:shd w:val="clear" w:color="auto" w:fill="F7FAFC"/>
+            <w:tcBorders>
+              <w:top w:val="single" w:sz="4" w:space="0" w:color="auto"/>
+              <w:left w:val="single" w:sz="4" w:space="0" w:color="auto"/>
+              <w:bottom w:val="single" w:sz="4" w:space="0" w:color="auto"/>
+              <w:right w:val="single" w:sz="4" w:space="0" w:color="auto"/>
+            </w:tcBorders>
+            <w:shd w:val="clear" w:fill="F7FAFC"/>
             <w:tcMar>
               <w:top w:w="80" w:type="dxa"/>
               <w:left w:w="120" w:type="dxa"/>
@@ -197,51 +213,60 @@
                 <w:b/>
                 <w:color w:val="000000" w:themeColor="text1"/>
                 <w:sz w:val="21"/>
-                <w:lang w:val="es-BO"/>
               </w:rPr>
             </w:pPr>
             <w:r>
               <w:rPr>
+                <w:rFonts w:ascii="Arial" w:hAnsi="Arial" w:eastAsia="ＭＳ 明朝" w:cs="Arial" w:eastAsiaTheme="minorEastAsia" w:csTheme="minorBidi"/>
                 <w:b/>
+                <w:bCs/>
                 <w:color w:val="000000" w:themeColor="text1"/>
                 <w:sz w:val="21"/>
-                <w:lang w:val="es-BO"/>
+                <w:szCs w:val="22"/>
               </w:rPr>
               <w:t>SIGLA</w:t>
             </w:r>
             <w:r>
               <w:rPr>
+                <w:rFonts w:ascii="Arial" w:hAnsi="Arial" w:eastAsia="ＭＳ 明朝" w:cs="Arial" w:eastAsiaTheme="minorEastAsia" w:csTheme="minorBidi"/>
                 <w:b/>
+                <w:bCs/>
                 <w:color w:val="000000" w:themeColor="text1"/>
                 <w:sz w:val="21"/>
-                <w:lang w:val="es-BO"/>
+                <w:szCs w:val="22"/>
               </w:rPr>
               <w:t>(</w:t>
             </w:r>
             <w:r>
               <w:rPr>
+                <w:rFonts w:ascii="Arial" w:hAnsi="Arial" w:eastAsia="ＭＳ 明朝" w:cs="Arial" w:eastAsiaTheme="minorEastAsia" w:csTheme="minorBidi"/>
                 <w:b/>
+                <w:bCs/>
                 <w:color w:val="000000" w:themeColor="text1"/>
                 <w:sz w:val="21"/>
-                <w:lang w:val="es-BO"/>
+                <w:szCs w:val="22"/>
               </w:rPr>
               <w:t>S</w:t>
             </w:r>
             <w:r>
               <w:rPr>
+                <w:rFonts w:ascii="Arial" w:hAnsi="Arial" w:eastAsia="ＭＳ 明朝" w:cs="Arial" w:eastAsiaTheme="minorEastAsia" w:csTheme="minorBidi"/>
                 <w:b/>
+                <w:bCs/>
                 <w:color w:val="000000" w:themeColor="text1"/>
                 <w:sz w:val="21"/>
-                <w:lang w:val="es-BO"/>
+                <w:szCs w:val="22"/>
               </w:rPr>
               <w:t>)</w:t>
             </w:r>
             <w:r>
               <w:rPr>
+                <w:rFonts w:ascii="Arial" w:hAnsi="Arial" w:eastAsia="ＭＳ 明朝" w:cs="Arial" w:eastAsiaTheme="minorEastAsia" w:csTheme="minorBidi"/>
                 <w:b/>
+                <w:bCs/>
                 <w:color w:val="000000" w:themeColor="text1"/>
                 <w:sz w:val="21"/>
-                <w:lang w:val="es-BO"/>
+                <w:szCs w:val="22"/>
               </w:rPr>
               <w:t>:</w:t>
             </w:r>
@@ -250,7 +275,13 @@
         <w:tc>
           <w:tcPr>
             <w:tcW w:w="7397" w:type="dxa"/>
-            <w:shd w:val="clear" w:color="auto" w:fill="FFFFFF"/>
+            <w:tcBorders>
+              <w:top w:val="single" w:sz="4" w:space="0" w:color="auto"/>
+              <w:left w:val="single" w:sz="4" w:space="0" w:color="auto"/>
+              <w:bottom w:val="single" w:sz="4" w:space="0" w:color="auto"/>
+              <w:right w:val="single" w:sz="4" w:space="0" w:color="auto"/>
+            </w:tcBorders>
+            <w:shd w:val="clear" w:fill="FFFFFF"/>
             <w:tcMar>
               <w:top w:w="80" w:type="dxa"/>
               <w:left w:w="120" w:type="dxa"/>
@@ -264,7 +295,6 @@
               <w:rPr>
                 <w:color w:val="000000" w:themeColor="text1"/>
                 <w:sz w:val="21"/>
-                <w:lang w:val="es-BO"/>
               </w:rPr>
             </w:pPr>
           </w:p>
@@ -274,7 +304,13 @@
         <w:tc>
           <w:tcPr>
             <w:tcW w:w="1963" w:type="dxa"/>
-            <w:shd w:val="clear" w:color="auto" w:fill="F7FAFC"/>
+            <w:tcBorders>
+              <w:top w:val="single" w:sz="4" w:space="0" w:color="auto"/>
+              <w:left w:val="single" w:sz="4" w:space="0" w:color="auto"/>
+              <w:bottom w:val="single" w:sz="4" w:space="0" w:color="auto"/>
+              <w:right w:val="single" w:sz="4" w:space="0" w:color="auto"/>
+            </w:tcBorders>
+            <w:shd w:val="clear" w:fill="F7FAFC"/>
             <w:tcMar>
               <w:top w:w="80" w:type="dxa"/>
               <w:left w:w="120" w:type="dxa"/>
@@ -287,15 +323,16 @@
               <w:spacing w:before="80" w:after="80"/>
               <w:rPr>
                 <w:color w:val="000000" w:themeColor="text1"/>
-                <w:lang w:val="es-BO"/>
               </w:rPr>
             </w:pPr>
             <w:r>
               <w:rPr>
+                <w:rFonts w:ascii="Arial" w:hAnsi="Arial" w:eastAsia="ＭＳ 明朝" w:cs="Arial" w:eastAsiaTheme="minorEastAsia" w:csTheme="minorBidi"/>
                 <w:b/>
+                <w:bCs/>
                 <w:color w:val="000000" w:themeColor="text1"/>
                 <w:sz w:val="21"/>
-                <w:lang w:val="es-BO"/>
+                <w:szCs w:val="22"/>
               </w:rPr>
               <w:t>ESTUDIANTE(S):</w:t>
             </w:r>
@@ -304,7 +341,13 @@
         <w:tc>
           <w:tcPr>
             <w:tcW w:w="7397" w:type="dxa"/>
-            <w:shd w:val="clear" w:color="auto" w:fill="FFFFFF"/>
+            <w:tcBorders>
+              <w:top w:val="single" w:sz="4" w:space="0" w:color="auto"/>
+              <w:left w:val="single" w:sz="4" w:space="0" w:color="auto"/>
+              <w:bottom w:val="single" w:sz="4" w:space="0" w:color="auto"/>
+              <w:right w:val="single" w:sz="4" w:space="0" w:color="auto"/>
+            </w:tcBorders>
+            <w:shd w:val="clear" w:fill="FFFFFF"/>
             <w:tcMar>
               <w:top w:w="80" w:type="dxa"/>
               <w:left w:w="120" w:type="dxa"/>
@@ -318,25 +361,24 @@
               <w:rPr>
                 <w:color w:val="000000" w:themeColor="text1"/>
                 <w:sz w:val="21"/>
-                <w:lang w:val="es-BO"/>
               </w:rPr>
             </w:pPr>
             <w:r>
               <w:rPr>
+                <w:rFonts w:ascii="Arial" w:hAnsi="Arial" w:eastAsia="ＭＳ 明朝" w:cs="Arial" w:eastAsiaTheme="minorEastAsia" w:csTheme="minorBidi"/>
                 <w:color w:val="000000" w:themeColor="text1"/>
                 <w:sz w:val="21"/>
-                <w:lang w:val="es-BO"/>
+                <w:szCs w:val="22"/>
               </w:rPr>
-              <w:t>[ Apellido Paterno, Apellido Materno y Nombre(s) ]</w:t>
+              <w:t>1.-</w:t>
             </w:r>
             <w:r>
               <w:rPr>
-                <w:color w:val="000000" w:themeColor="text1"/>
+                <w:rFonts w:ascii="Consolas" w:cs="Consolas"/>
                 <w:sz w:val="21"/>
-                <w:lang w:val="es-BO"/>
+                <w:szCs w:val="21"/>
               </w:rPr>
-              <w:br/>
-              <w:t>1.-</w:t>
+              <w:t>Cordova Avendaño Yoshua Aaron</w:t>
             </w:r>
           </w:p>
           <w:p>
@@ -345,19 +387,25 @@
               <w:rPr>
                 <w:color w:val="000000" w:themeColor="text1"/>
                 <w:sz w:val="21"/>
-                <w:lang w:val="es-BO"/>
               </w:rPr>
             </w:pPr>
             <w:r>
               <w:rPr>
+                <w:rFonts w:ascii="Arial" w:hAnsi="Arial" w:eastAsia="ＭＳ 明朝" w:cs="Arial" w:eastAsiaTheme="minorEastAsia" w:csTheme="minorBidi"/>
                 <w:color w:val="000000" w:themeColor="text1"/>
                 <w:sz w:val="21"/>
-                <w:lang w:val="es-BO"/>
+                <w:szCs w:val="22"/>
               </w:rPr>
               <w:t>2.-</w:t>
             </w:r>
-            <w:bookmarkStart w:id="0" w:name="_GoBack"/>
-            <w:bookmarkEnd w:id="0"/>
+            <w:r>
+              <w:rPr>
+                <w:rFonts w:ascii="Consolas" w:cs="Consolas"/>
+                <w:sz w:val="21"/>
+                <w:szCs w:val="21"/>
+              </w:rPr>
+              <w:t>Sempertegui Flores Erick Sebastian</w:t>
+            </w:r>
           </w:p>
         </w:tc>
       </w:tr>
@@ -365,7 +413,13 @@
         <w:tc>
           <w:tcPr>
             <w:tcW w:w="1963" w:type="dxa"/>
-            <w:shd w:val="clear" w:color="auto" w:fill="F7FAFC"/>
+            <w:tcBorders>
+              <w:top w:val="single" w:sz="4" w:space="0" w:color="auto"/>
+              <w:left w:val="single" w:sz="4" w:space="0" w:color="auto"/>
+              <w:bottom w:val="single" w:sz="4" w:space="0" w:color="auto"/>
+              <w:right w:val="single" w:sz="4" w:space="0" w:color="auto"/>
+            </w:tcBorders>
+            <w:shd w:val="clear" w:fill="F7FAFC"/>
             <w:tcMar>
               <w:top w:w="80" w:type="dxa"/>
               <w:left w:w="120" w:type="dxa"/>
@@ -378,15 +432,16 @@
               <w:spacing w:before="80" w:after="80"/>
               <w:rPr>
                 <w:color w:val="000000" w:themeColor="text1"/>
-                <w:lang w:val="es-BO"/>
               </w:rPr>
             </w:pPr>
             <w:r>
               <w:rPr>
+                <w:rFonts w:ascii="Arial" w:hAnsi="Arial" w:eastAsia="ＭＳ 明朝" w:cs="Arial" w:eastAsiaTheme="minorEastAsia" w:csTheme="minorBidi"/>
                 <w:b/>
+                <w:bCs/>
                 <w:color w:val="000000" w:themeColor="text1"/>
                 <w:sz w:val="21"/>
-                <w:lang w:val="es-BO"/>
+                <w:szCs w:val="22"/>
               </w:rPr>
               <w:t>FECHA DE ENTREGA:</w:t>
             </w:r>
@@ -395,7 +450,13 @@
         <w:tc>
           <w:tcPr>
             <w:tcW w:w="7397" w:type="dxa"/>
-            <w:shd w:val="clear" w:color="auto" w:fill="FFFFFF"/>
+            <w:tcBorders>
+              <w:top w:val="single" w:sz="4" w:space="0" w:color="auto"/>
+              <w:left w:val="single" w:sz="4" w:space="0" w:color="auto"/>
+              <w:bottom w:val="single" w:sz="4" w:space="0" w:color="auto"/>
+              <w:right w:val="single" w:sz="4" w:space="0" w:color="auto"/>
+            </w:tcBorders>
+            <w:shd w:val="clear" w:fill="FFFFFF"/>
             <w:tcMar>
               <w:top w:w="80" w:type="dxa"/>
               <w:left w:w="120" w:type="dxa"/>
@@ -408,16 +469,16 @@
               <w:spacing w:before="80" w:after="80"/>
               <w:rPr>
                 <w:color w:val="000000" w:themeColor="text1"/>
-                <w:lang w:val="es-BO"/>
               </w:rPr>
             </w:pPr>
             <w:r>
               <w:rPr>
+                <w:rFonts w:ascii="Arial" w:hAnsi="Arial" w:eastAsia="ＭＳ 明朝" w:cs="Arial" w:eastAsiaTheme="minorEastAsia" w:csTheme="minorBidi"/>
                 <w:color w:val="000000" w:themeColor="text1"/>
                 <w:sz w:val="21"/>
-                <w:lang w:val="es-BO"/>
+                <w:szCs w:val="22"/>
               </w:rPr>
-              <w:t>[ Día de Mes de Año ]</w:t>
+              <w:t>09/09/2026</w:t>
             </w:r>
           </w:p>
         </w:tc>
@@ -425,17 +486,16 @@
     </w:tbl>
     <w:p>
       <w:pPr>
+        <w:pageBreakBefore/>
         <w:rPr>
           <w:color w:val="000000" w:themeColor="text1"/>
-          <w:lang w:val="es-BO"/>
         </w:rPr>
       </w:pPr>
       <w:r>
+        <w:lastRenderedPageBreak/>
         <w:rPr>
           <w:color w:val="000000" w:themeColor="text1"/>
-          <w:lang w:val="es-BO"/>
         </w:rPr>
-        <w:br w:type="page"/>
       </w:r>
     </w:p>
     <w:p>
@@ -443,17 +503,18 @@
         <w:spacing w:before="240" w:after="240"/>
         <w:rPr>
           <w:color w:val="000000" w:themeColor="text1"/>
-          <w:lang w:val="es-BO"/>
         </w:rPr>
       </w:pPr>
       <w:r>
+        <w:lastRenderedPageBreak/>
         <w:rPr>
+          <w:rFonts w:ascii="Arial" w:hAnsi="Arial" w:eastAsia="ＭＳ 明朝" w:cs="Arial" w:eastAsiaTheme="minorEastAsia" w:csTheme="minorBidi"/>
           <w:b/>
+          <w:bCs/>
           <w:color w:val="000000" w:themeColor="text1"/>
           <w:sz w:val="28"/>
-          <w:lang w:val="es-BO"/>
+          <w:szCs w:val="22"/>
         </w:rPr>
-        <w:lastRenderedPageBreak/>
         <w:t>1. INTRODUCCIÓN</w:t>
       </w:r>
     </w:p>
@@ -462,13 +523,14 @@
         <w:spacing w:after="240"/>
         <w:rPr>
           <w:color w:val="000000" w:themeColor="text1"/>
-          <w:lang w:val="es-BO"/>
         </w:rPr>
       </w:pPr>
       <w:r>
         <w:rPr>
+          <w:rFonts w:ascii="Arial" w:hAnsi="Arial" w:eastAsia="ＭＳ 明朝" w:cs="Arial" w:eastAsiaTheme="minorEastAsia" w:csTheme="minorBidi"/>
           <w:color w:val="000000" w:themeColor="text1"/>
-          <w:lang w:val="es-BO"/>
+          <w:sz w:val="22"/>
+          <w:szCs w:val="22"/>
         </w:rPr>
         <w:t>Escriba aquí la introducción de su trabajo. Esta plantilla está prediseñada con tipografía Arial, espaciado optimizado y márgenes estándar para brindar una presentación limpia y académica.</w:t>
       </w:r>
@@ -478,15 +540,16 @@
         <w:spacing w:before="240" w:after="240"/>
         <w:rPr>
           <w:color w:val="000000" w:themeColor="text1"/>
-          <w:lang w:val="es-BO"/>
         </w:rPr>
       </w:pPr>
       <w:r>
         <w:rPr>
+          <w:rFonts w:ascii="Arial" w:hAnsi="Arial" w:eastAsia="ＭＳ 明朝" w:cs="Arial" w:eastAsiaTheme="minorEastAsia" w:csTheme="minorBidi"/>
           <w:b/>
+          <w:bCs/>
           <w:color w:val="000000" w:themeColor="text1"/>
           <w:sz w:val="28"/>
-          <w:lang w:val="es-BO"/>
+          <w:szCs w:val="22"/>
         </w:rPr>
         <w:t>2. DESARROLLO</w:t>
       </w:r>
@@ -496,13 +559,14 @@
         <w:spacing w:after="240"/>
         <w:rPr>
           <w:color w:val="000000" w:themeColor="text1"/>
-          <w:lang w:val="es-BO"/>
         </w:rPr>
       </w:pPr>
       <w:r>
         <w:rPr>
+          <w:rFonts w:ascii="Arial" w:hAnsi="Arial" w:eastAsia="ＭＳ 明朝" w:cs="Arial" w:eastAsiaTheme="minorEastAsia" w:csTheme="minorBidi"/>
           <w:color w:val="000000" w:themeColor="text1"/>
-          <w:lang w:val="es-BO"/>
+          <w:sz w:val="22"/>
+          <w:szCs w:val="22"/>
         </w:rPr>
         <w:t>Redacte el contenido principal, análisis o hallazgos del trabajo. Puede estructurar su texto utilizando subtítulos y tablas según sea necesario.</w:t>
       </w:r>
@@ -512,15 +576,16 @@
         <w:spacing w:before="160" w:after="120"/>
         <w:rPr>
           <w:color w:val="000000" w:themeColor="text1"/>
-          <w:lang w:val="es-BO"/>
         </w:rPr>
       </w:pPr>
       <w:r>
         <w:rPr>
+          <w:rFonts w:ascii="Arial" w:hAnsi="Arial" w:eastAsia="ＭＳ 明朝" w:cs="Arial" w:eastAsiaTheme="minorEastAsia" w:csTheme="minorBidi"/>
           <w:b/>
+          <w:bCs/>
           <w:color w:val="000000" w:themeColor="text1"/>
           <w:sz w:val="24"/>
-          <w:lang w:val="es-BO"/>
+          <w:szCs w:val="22"/>
         </w:rPr>
         <w:t>2.1. Subsección o Punto Específico</w:t>
       </w:r>
@@ -530,13 +595,14 @@
         <w:spacing w:after="240"/>
         <w:rPr>
           <w:color w:val="000000" w:themeColor="text1"/>
-          <w:lang w:val="es-BO"/>
         </w:rPr>
       </w:pPr>
       <w:r>
         <w:rPr>
+          <w:rFonts w:ascii="Arial" w:hAnsi="Arial" w:eastAsia="ＭＳ 明朝" w:cs="Arial" w:eastAsiaTheme="minorEastAsia" w:csTheme="minorBidi"/>
           <w:color w:val="000000" w:themeColor="text1"/>
-          <w:lang w:val="es-BO"/>
+          <w:sz w:val="22"/>
+          <w:szCs w:val="22"/>
         </w:rPr>
         <w:t>Detalles adicionales sobre el tema desarrollado, tablas de soporte o gráficos ilustrativos.</w:t>
       </w:r>
@@ -544,7 +610,6 @@
     <w:sectPr>
       <w:pgSz w:w="12240" w:h="15840"/>
       <w:pgMar w:top="1440" w:right="1440" w:bottom="1440" w:left="1440" w:header="720" w:footer="720" w:gutter="0"/>
-      <w:cols w:space="720"/>
       <w:docGrid w:linePitch="360"/>
     </w:sectPr>
   </w:body>

</xml_diff>